<commit_message>
Seção 2 em construção
</commit_message>
<xml_diff>
--- a/historicos/template_concluinte.docx
+++ b/historicos/template_concluinte.docx
@@ -303,7 +303,7 @@
             <v:imagedata r:id="rId8" o:title=""/>
             <w10:wrap anchorx="page" anchory="page"/>
           </v:shape>
-          <o:OLEObject Type="Embed" ProgID="MS_ClipArt_Gallery" ShapeID="_x0000_s1026" DrawAspect="Content" ObjectID="_1836374353" r:id="rId9"/>
+          <o:OLEObject Type="Embed" ProgID="MS_ClipArt_Gallery" ShapeID="_x0000_s1026" DrawAspect="Content" ObjectID="_1836384772" r:id="rId9"/>
         </w:object>
       </w:r>
       <w:r>
@@ -1734,7 +1734,7 @@
       <w:tr>
         <w:trPr>
           <w:cantSplit/>
-          <w:trHeight w:val="4469"/>
+          <w:trHeight w:val="358"/>
         </w:trPr>
         <w:tc>
           <w:tcPr>
@@ -1802,27 +1802,31 @@
             <w:r>
               <w:rPr>
                 <w:rFonts w:ascii="Century Gothic" w:hAnsi="Century Gothic" w:cs="Lucida Sans Unicode"/>
-                <w:bCs/>
-                <w:sz w:val="20"/>
-              </w:rPr>
-              <w:t xml:space="preserve">{#disciplinas} </w:t>
-            </w:r>
-            <w:r>
-              <w:rPr>
-                <w:rFonts w:ascii="Century Gothic" w:hAnsi="Century Gothic" w:cs="Lucida Sans Unicode"/>
-                <w:bCs/>
-                <w:sz w:val="20"/>
-                <w:bdr w:val="single" w:sz="4" w:space="0" w:color="auto"/>
-              </w:rPr>
-              <w:t>{nome}</w:t>
-            </w:r>
-            <w:r>
-              <w:rPr>
-                <w:rFonts w:ascii="Century Gothic" w:hAnsi="Century Gothic" w:cs="Lucida Sans Unicode"/>
-                <w:bCs/>
-                <w:sz w:val="20"/>
-              </w:rPr>
-              <w:t xml:space="preserve"> {/disciplinas}</w:t>
+                <w:b/>
+                <w:bCs/>
+                <w:sz w:val="20"/>
+              </w:rPr>
+              <w:t>{#</w:t>
+            </w:r>
+            <w:proofErr w:type="gramStart"/>
+            <w:r>
+              <w:rPr>
+                <w:rFonts w:ascii="Century Gothic" w:hAnsi="Century Gothic" w:cs="Lucida Sans Unicode"/>
+                <w:b/>
+                <w:bCs/>
+                <w:sz w:val="20"/>
+              </w:rPr>
+              <w:t>disciplinas}{</w:t>
+            </w:r>
+            <w:proofErr w:type="gramEnd"/>
+            <w:r>
+              <w:rPr>
+                <w:rFonts w:ascii="Century Gothic" w:hAnsi="Century Gothic" w:cs="Lucida Sans Unicode"/>
+                <w:b/>
+                <w:bCs/>
+                <w:sz w:val="20"/>
+              </w:rPr>
+              <w:t>nome}</w:t>
             </w:r>
           </w:p>
         </w:tc>
@@ -1836,12 +1840,10 @@
               <w:right w:val="single" w:sz="4" w:space="0" w:color="auto"/>
               <w:tr2bl w:val="nil"/>
             </w:tcBorders>
-            <w:textDirection w:val="btLr"/>
-            <w:vAlign w:val="center"/>
-          </w:tcPr>
-          <w:p>
-            <w:pPr>
-              <w:ind w:left="113" w:right="113"/>
+            <w:vAlign w:val="center"/>
+          </w:tcPr>
+          <w:p>
+            <w:pPr>
               <w:jc w:val="center"/>
               <w:rPr>
                 <w:rFonts w:ascii="Century Gothic" w:hAnsi="Century Gothic" w:cs="Arial"/>
@@ -1852,27 +1854,12 @@
             <w:r>
               <w:rPr>
                 <w:rFonts w:ascii="Century Gothic" w:hAnsi="Century Gothic" w:cs="Arial"/>
+                <w:b/>
+                <w:bCs/>
                 <w:sz w:val="20"/>
                 <w:lang w:eastAsia="en-US"/>
               </w:rPr>
-              <w:t>{#exibirNotas_1} {#disciplinas} {nota} {/disciplinas} {/</w:t>
-            </w:r>
-            <w:r>
-              <w:rPr>
-                <w:rFonts w:ascii="Century Gothic" w:hAnsi="Century Gothic" w:cs="Arial"/>
-                <w:sz w:val="20"/>
-                <w:bdr w:val="single" w:sz="4" w:space="0" w:color="auto"/>
-                <w:lang w:eastAsia="en-US"/>
-              </w:rPr>
-              <w:t>exibirNotas</w:t>
-            </w:r>
-            <w:r>
-              <w:rPr>
-                <w:rFonts w:ascii="Century Gothic" w:hAnsi="Century Gothic" w:cs="Arial"/>
-                <w:sz w:val="20"/>
-                <w:lang w:eastAsia="en-US"/>
-              </w:rPr>
-              <w:t>_1} {#exibirResolucao_1} {TEXTO_DA_RESOLUCAO} {/exibirResolucao_1}</w:t>
+              <w:t>{nota_1}</w:t>
             </w:r>
           </w:p>
         </w:tc>
@@ -1885,12 +1872,10 @@
               <w:bottom w:val="single" w:sz="4" w:space="0" w:color="auto"/>
               <w:right w:val="single" w:sz="4" w:space="0" w:color="auto"/>
             </w:tcBorders>
-            <w:textDirection w:val="btLr"/>
-            <w:vAlign w:val="center"/>
-          </w:tcPr>
-          <w:p>
-            <w:pPr>
-              <w:ind w:left="113" w:right="113"/>
+            <w:vAlign w:val="center"/>
+          </w:tcPr>
+          <w:p>
+            <w:pPr>
               <w:jc w:val="center"/>
               <w:rPr>
                 <w:rFonts w:ascii="Century Gothic" w:hAnsi="Century Gothic" w:cs="Arial"/>
@@ -1902,389 +1887,190 @@
             <w:r>
               <w:rPr>
                 <w:rFonts w:ascii="Century Gothic" w:hAnsi="Century Gothic" w:cs="Arial"/>
+                <w:b/>
+                <w:bCs/>
+                <w:sz w:val="20"/>
+                <w:lang w:eastAsia="en-US"/>
+              </w:rPr>
+              <w:t>{nota_</w:t>
+            </w:r>
+            <w:r>
+              <w:rPr>
+                <w:rFonts w:ascii="Century Gothic" w:hAnsi="Century Gothic" w:cs="Arial"/>
+                <w:b/>
+                <w:bCs/>
+                <w:sz w:val="20"/>
+                <w:lang w:eastAsia="en-US"/>
+              </w:rPr>
+              <w:t>2</w:t>
+            </w:r>
+            <w:r>
+              <w:rPr>
+                <w:rFonts w:ascii="Century Gothic" w:hAnsi="Century Gothic" w:cs="Arial"/>
+                <w:b/>
+                <w:bCs/>
+                <w:sz w:val="20"/>
+                <w:lang w:eastAsia="en-US"/>
+              </w:rPr>
+              <w:t>}</w:t>
+            </w:r>
+          </w:p>
+        </w:tc>
+        <w:tc>
+          <w:tcPr>
+            <w:tcW w:w="1333" w:type="dxa"/>
+            <w:tcBorders>
+              <w:top w:val="single" w:sz="4" w:space="0" w:color="auto"/>
+              <w:left w:val="single" w:sz="4" w:space="0" w:color="auto"/>
+              <w:bottom w:val="single" w:sz="4" w:space="0" w:color="auto"/>
+              <w:right w:val="single" w:sz="4" w:space="0" w:color="auto"/>
+            </w:tcBorders>
+            <w:vAlign w:val="center"/>
+          </w:tcPr>
+          <w:p>
+            <w:pPr>
+              <w:jc w:val="center"/>
+              <w:rPr>
+                <w:rFonts w:ascii="Century Gothic" w:hAnsi="Century Gothic" w:cs="Arial"/>
+                <w:bCs/>
                 <w:sz w:val="20"/>
                 <w:szCs w:val="20"/>
                 <w:lang w:eastAsia="en-US"/>
               </w:rPr>
-              <w:t>{#exibirNotas_</w:t>
-            </w:r>
+            </w:pPr>
             <w:r>
               <w:rPr>
                 <w:rFonts w:ascii="Century Gothic" w:hAnsi="Century Gothic" w:cs="Arial"/>
-                <w:sz w:val="20"/>
-                <w:szCs w:val="20"/>
+                <w:b/>
+                <w:bCs/>
+                <w:sz w:val="20"/>
                 <w:lang w:eastAsia="en-US"/>
               </w:rPr>
-              <w:t>2</w:t>
+              <w:t>{nota_</w:t>
             </w:r>
             <w:r>
               <w:rPr>
                 <w:rFonts w:ascii="Century Gothic" w:hAnsi="Century Gothic" w:cs="Arial"/>
-                <w:sz w:val="20"/>
-                <w:szCs w:val="20"/>
+                <w:b/>
+                <w:bCs/>
+                <w:sz w:val="20"/>
                 <w:lang w:eastAsia="en-US"/>
               </w:rPr>
-              <w:t>} {#disciplinas} {nota} {/disciplinas} {/exibirNotas_</w:t>
+              <w:t>3</w:t>
             </w:r>
             <w:r>
               <w:rPr>
                 <w:rFonts w:ascii="Century Gothic" w:hAnsi="Century Gothic" w:cs="Arial"/>
-                <w:sz w:val="20"/>
-                <w:szCs w:val="20"/>
+                <w:b/>
+                <w:bCs/>
+                <w:sz w:val="20"/>
                 <w:lang w:eastAsia="en-US"/>
               </w:rPr>
-              <w:t>2</w:t>
-            </w:r>
+              <w:t>}</w:t>
+            </w:r>
+          </w:p>
+        </w:tc>
+        <w:tc>
+          <w:tcPr>
+            <w:tcW w:w="1417" w:type="dxa"/>
+            <w:tcBorders>
+              <w:top w:val="nil"/>
+              <w:left w:val="single" w:sz="4" w:space="0" w:color="auto"/>
+              <w:right w:val="single" w:sz="4" w:space="0" w:color="auto"/>
+            </w:tcBorders>
+            <w:vAlign w:val="center"/>
+          </w:tcPr>
+          <w:p>
+            <w:pPr>
+              <w:jc w:val="center"/>
+              <w:rPr>
+                <w:rFonts w:ascii="Century Gothic" w:hAnsi="Century Gothic" w:cs="Lucida Sans Unicode"/>
+                <w:bCs/>
+                <w:sz w:val="20"/>
+              </w:rPr>
+            </w:pPr>
             <w:r>
               <w:rPr>
                 <w:rFonts w:ascii="Century Gothic" w:hAnsi="Century Gothic" w:cs="Arial"/>
-                <w:sz w:val="20"/>
-                <w:szCs w:val="20"/>
+                <w:b/>
+                <w:bCs/>
+                <w:sz w:val="20"/>
                 <w:lang w:eastAsia="en-US"/>
               </w:rPr>
-              <w:t>} {#exibirResolucao_</w:t>
+              <w:t>{nota_</w:t>
             </w:r>
             <w:r>
               <w:rPr>
                 <w:rFonts w:ascii="Century Gothic" w:hAnsi="Century Gothic" w:cs="Arial"/>
-                <w:sz w:val="20"/>
-                <w:szCs w:val="20"/>
+                <w:b/>
+                <w:bCs/>
+                <w:sz w:val="20"/>
                 <w:lang w:eastAsia="en-US"/>
               </w:rPr>
-              <w:t>2</w:t>
+              <w:t>4</w:t>
             </w:r>
             <w:r>
               <w:rPr>
                 <w:rFonts w:ascii="Century Gothic" w:hAnsi="Century Gothic" w:cs="Arial"/>
-                <w:sz w:val="20"/>
-                <w:szCs w:val="20"/>
+                <w:b/>
+                <w:bCs/>
+                <w:sz w:val="20"/>
                 <w:lang w:eastAsia="en-US"/>
               </w:rPr>
-              <w:t>} {TEXTO_DA_RESOLUCAO} {/exibirResolucao_</w:t>
-            </w:r>
-            <w:r>
+              <w:t>}</w:t>
+            </w:r>
+          </w:p>
+        </w:tc>
+        <w:tc>
+          <w:tcPr>
+            <w:tcW w:w="1503" w:type="dxa"/>
+            <w:tcBorders>
+              <w:top w:val="nil"/>
+              <w:left w:val="single" w:sz="4" w:space="0" w:color="auto"/>
+              <w:right w:val="single" w:sz="4" w:space="0" w:color="auto"/>
+            </w:tcBorders>
+            <w:vAlign w:val="center"/>
+          </w:tcPr>
+          <w:p>
+            <w:pPr>
+              <w:jc w:val="center"/>
               <w:rPr>
                 <w:rFonts w:ascii="Century Gothic" w:hAnsi="Century Gothic" w:cs="Arial"/>
                 <w:sz w:val="20"/>
-                <w:szCs w:val="20"/>
                 <w:lang w:eastAsia="en-US"/>
               </w:rPr>
-              <w:t>2</w:t>
-            </w:r>
+            </w:pPr>
             <w:r>
               <w:rPr>
                 <w:rFonts w:ascii="Century Gothic" w:hAnsi="Century Gothic" w:cs="Arial"/>
-                <w:sz w:val="20"/>
-                <w:szCs w:val="20"/>
+                <w:b/>
+                <w:bCs/>
+                <w:sz w:val="20"/>
                 <w:lang w:eastAsia="en-US"/>
               </w:rPr>
-              <w:t>}</w:t>
-            </w:r>
-          </w:p>
-        </w:tc>
-        <w:tc>
-          <w:tcPr>
-            <w:tcW w:w="1333" w:type="dxa"/>
-            <w:tcBorders>
-              <w:top w:val="single" w:sz="4" w:space="0" w:color="auto"/>
-              <w:left w:val="single" w:sz="4" w:space="0" w:color="auto"/>
-              <w:bottom w:val="single" w:sz="4" w:space="0" w:color="auto"/>
-              <w:right w:val="single" w:sz="4" w:space="0" w:color="auto"/>
-            </w:tcBorders>
-            <w:textDirection w:val="btLr"/>
-            <w:vAlign w:val="center"/>
-          </w:tcPr>
-          <w:p>
-            <w:pPr>
-              <w:ind w:left="113" w:right="113"/>
-              <w:jc w:val="center"/>
+              <w:t>{nota_</w:t>
+            </w:r>
+            <w:proofErr w:type="gramStart"/>
+            <w:r>
               <w:rPr>
                 <w:rFonts w:ascii="Century Gothic" w:hAnsi="Century Gothic" w:cs="Arial"/>
-                <w:bCs/>
-                <w:sz w:val="20"/>
-                <w:szCs w:val="20"/>
+                <w:b/>
+                <w:bCs/>
+                <w:sz w:val="20"/>
                 <w:lang w:eastAsia="en-US"/>
               </w:rPr>
-            </w:pPr>
+              <w:t>5}{</w:t>
+            </w:r>
+            <w:proofErr w:type="gramEnd"/>
             <w:r>
               <w:rPr>
                 <w:rFonts w:ascii="Century Gothic" w:hAnsi="Century Gothic" w:cs="Arial"/>
-                <w:bCs/>
-                <w:sz w:val="20"/>
-                <w:szCs w:val="20"/>
+                <w:b/>
+                <w:bCs/>
+                <w:sz w:val="20"/>
                 <w:lang w:eastAsia="en-US"/>
               </w:rPr>
-              <w:t>{#exibirNotas_</w:t>
-            </w:r>
-            <w:r>
-              <w:rPr>
-                <w:rFonts w:ascii="Century Gothic" w:hAnsi="Century Gothic" w:cs="Arial"/>
-                <w:bCs/>
-                <w:sz w:val="20"/>
-                <w:szCs w:val="20"/>
-                <w:lang w:eastAsia="en-US"/>
-              </w:rPr>
-              <w:t>3</w:t>
-            </w:r>
-            <w:r>
-              <w:rPr>
-                <w:rFonts w:ascii="Century Gothic" w:hAnsi="Century Gothic" w:cs="Arial"/>
-                <w:bCs/>
-                <w:sz w:val="20"/>
-                <w:szCs w:val="20"/>
-                <w:lang w:eastAsia="en-US"/>
-              </w:rPr>
-              <w:t>} {#disciplinas} {nota} {/disciplinas} {/exibirNotas_</w:t>
-            </w:r>
-            <w:r>
-              <w:rPr>
-                <w:rFonts w:ascii="Century Gothic" w:hAnsi="Century Gothic" w:cs="Arial"/>
-                <w:bCs/>
-                <w:sz w:val="20"/>
-                <w:szCs w:val="20"/>
-                <w:lang w:eastAsia="en-US"/>
-              </w:rPr>
-              <w:t>3</w:t>
-            </w:r>
-            <w:r>
-              <w:rPr>
-                <w:rFonts w:ascii="Century Gothic" w:hAnsi="Century Gothic" w:cs="Arial"/>
-                <w:bCs/>
-                <w:sz w:val="20"/>
-                <w:szCs w:val="20"/>
-                <w:lang w:eastAsia="en-US"/>
-              </w:rPr>
-              <w:t>} {#exibirResolucao_</w:t>
-            </w:r>
-            <w:r>
-              <w:rPr>
-                <w:rFonts w:ascii="Century Gothic" w:hAnsi="Century Gothic" w:cs="Arial"/>
-                <w:bCs/>
-                <w:sz w:val="20"/>
-                <w:szCs w:val="20"/>
-                <w:lang w:eastAsia="en-US"/>
-              </w:rPr>
-              <w:t>3</w:t>
-            </w:r>
-            <w:r>
-              <w:rPr>
-                <w:rFonts w:ascii="Century Gothic" w:hAnsi="Century Gothic" w:cs="Arial"/>
-                <w:bCs/>
-                <w:sz w:val="20"/>
-                <w:szCs w:val="20"/>
-                <w:lang w:eastAsia="en-US"/>
-              </w:rPr>
-              <w:t>} {TEXTO_DA_RESOLUCAO} {/exibirResolucao_</w:t>
-            </w:r>
-            <w:r>
-              <w:rPr>
-                <w:rFonts w:ascii="Century Gothic" w:hAnsi="Century Gothic" w:cs="Arial"/>
-                <w:bCs/>
-                <w:sz w:val="20"/>
-                <w:szCs w:val="20"/>
-                <w:lang w:eastAsia="en-US"/>
-              </w:rPr>
-              <w:t>3</w:t>
-            </w:r>
-            <w:r>
-              <w:rPr>
-                <w:rFonts w:ascii="Century Gothic" w:hAnsi="Century Gothic" w:cs="Arial"/>
-                <w:bCs/>
-                <w:sz w:val="20"/>
-                <w:szCs w:val="20"/>
-                <w:lang w:eastAsia="en-US"/>
-              </w:rPr>
-              <w:t>}</w:t>
-            </w:r>
-          </w:p>
-        </w:tc>
-        <w:tc>
-          <w:tcPr>
-            <w:tcW w:w="1417" w:type="dxa"/>
-            <w:tcBorders>
-              <w:top w:val="nil"/>
-              <w:left w:val="single" w:sz="4" w:space="0" w:color="auto"/>
-              <w:right w:val="single" w:sz="4" w:space="0" w:color="auto"/>
-            </w:tcBorders>
-            <w:textDirection w:val="btLr"/>
-            <w:vAlign w:val="center"/>
-          </w:tcPr>
-          <w:p>
-            <w:pPr>
-              <w:ind w:left="113" w:right="113"/>
-              <w:jc w:val="center"/>
-              <w:rPr>
-                <w:rFonts w:ascii="Century Gothic" w:hAnsi="Century Gothic" w:cs="Lucida Sans Unicode"/>
-                <w:bCs/>
-                <w:sz w:val="20"/>
-              </w:rPr>
-            </w:pPr>
-            <w:r>
-              <w:rPr>
-                <w:rFonts w:ascii="Century Gothic" w:hAnsi="Century Gothic" w:cs="Lucida Sans Unicode"/>
-                <w:bCs/>
-                <w:sz w:val="20"/>
-              </w:rPr>
-              <w:t>{#exibirNotas_</w:t>
-            </w:r>
-            <w:r>
-              <w:rPr>
-                <w:rFonts w:ascii="Century Gothic" w:hAnsi="Century Gothic" w:cs="Lucida Sans Unicode"/>
-                <w:bCs/>
-                <w:sz w:val="20"/>
-              </w:rPr>
-              <w:t>4</w:t>
-            </w:r>
-            <w:r>
-              <w:rPr>
-                <w:rFonts w:ascii="Century Gothic" w:hAnsi="Century Gothic" w:cs="Lucida Sans Unicode"/>
-                <w:bCs/>
-                <w:sz w:val="20"/>
-              </w:rPr>
-              <w:t>} {#disciplinas} {nota} {/disciplinas} {/exibirNotas_</w:t>
-            </w:r>
-            <w:r>
-              <w:rPr>
-                <w:rFonts w:ascii="Century Gothic" w:hAnsi="Century Gothic" w:cs="Lucida Sans Unicode"/>
-                <w:bCs/>
-                <w:sz w:val="20"/>
-              </w:rPr>
-              <w:t>4</w:t>
-            </w:r>
-            <w:r>
-              <w:rPr>
-                <w:rFonts w:ascii="Century Gothic" w:hAnsi="Century Gothic" w:cs="Lucida Sans Unicode"/>
-                <w:bCs/>
-                <w:sz w:val="20"/>
-              </w:rPr>
-              <w:t>} {#exibirResolucao_</w:t>
-            </w:r>
-            <w:r>
-              <w:rPr>
-                <w:rFonts w:ascii="Century Gothic" w:hAnsi="Century Gothic" w:cs="Lucida Sans Unicode"/>
-                <w:bCs/>
-                <w:sz w:val="20"/>
-              </w:rPr>
-              <w:t>4</w:t>
-            </w:r>
-            <w:r>
-              <w:rPr>
-                <w:rFonts w:ascii="Century Gothic" w:hAnsi="Century Gothic" w:cs="Lucida Sans Unicode"/>
-                <w:bCs/>
-                <w:sz w:val="20"/>
-              </w:rPr>
-              <w:t>} {TEXTO_DA_RESOLUCAO} {/exibirResolucao_</w:t>
-            </w:r>
-            <w:r>
-              <w:rPr>
-                <w:rFonts w:ascii="Century Gothic" w:hAnsi="Century Gothic" w:cs="Lucida Sans Unicode"/>
-                <w:bCs/>
-                <w:sz w:val="20"/>
-              </w:rPr>
-              <w:t>4</w:t>
-            </w:r>
-            <w:r>
-              <w:rPr>
-                <w:rFonts w:ascii="Century Gothic" w:hAnsi="Century Gothic" w:cs="Lucida Sans Unicode"/>
-                <w:bCs/>
-                <w:sz w:val="20"/>
-              </w:rPr>
-              <w:t>}</w:t>
-            </w:r>
-          </w:p>
-        </w:tc>
-        <w:tc>
-          <w:tcPr>
-            <w:tcW w:w="1503" w:type="dxa"/>
-            <w:tcBorders>
-              <w:top w:val="nil"/>
-              <w:left w:val="single" w:sz="4" w:space="0" w:color="auto"/>
-              <w:right w:val="single" w:sz="4" w:space="0" w:color="auto"/>
-            </w:tcBorders>
-            <w:textDirection w:val="btLr"/>
-            <w:vAlign w:val="center"/>
-          </w:tcPr>
-          <w:p>
-            <w:pPr>
-              <w:ind w:left="113" w:right="113"/>
-              <w:jc w:val="center"/>
-              <w:rPr>
-                <w:rFonts w:ascii="Century Gothic" w:hAnsi="Century Gothic" w:cs="Arial"/>
-                <w:sz w:val="20"/>
-                <w:lang w:eastAsia="en-US"/>
-              </w:rPr>
-            </w:pPr>
-            <w:r>
-              <w:rPr>
-                <w:rFonts w:ascii="Century Gothic" w:hAnsi="Century Gothic" w:cs="Arial"/>
-                <w:sz w:val="20"/>
-                <w:lang w:eastAsia="en-US"/>
-              </w:rPr>
-              <w:t>{#exibirNotas_</w:t>
-            </w:r>
-            <w:r>
-              <w:rPr>
-                <w:rFonts w:ascii="Century Gothic" w:hAnsi="Century Gothic" w:cs="Arial"/>
-                <w:sz w:val="20"/>
-                <w:lang w:eastAsia="en-US"/>
-              </w:rPr>
-              <w:t>5</w:t>
-            </w:r>
-            <w:r>
-              <w:rPr>
-                <w:rFonts w:ascii="Century Gothic" w:hAnsi="Century Gothic" w:cs="Arial"/>
-                <w:sz w:val="20"/>
-                <w:lang w:eastAsia="en-US"/>
-              </w:rPr>
-              <w:t>} {#disciplinas} {nota} {/disciplinas} {/exibirNotas_</w:t>
-            </w:r>
-            <w:r>
-              <w:rPr>
-                <w:rFonts w:ascii="Century Gothic" w:hAnsi="Century Gothic" w:cs="Arial"/>
-                <w:sz w:val="20"/>
-                <w:lang w:eastAsia="en-US"/>
-              </w:rPr>
-              <w:t>5</w:t>
-            </w:r>
-            <w:r>
-              <w:rPr>
-                <w:rFonts w:ascii="Century Gothic" w:hAnsi="Century Gothic" w:cs="Arial"/>
-                <w:sz w:val="20"/>
-                <w:lang w:eastAsia="en-US"/>
-              </w:rPr>
-              <w:t>} {#exibirResolucao_</w:t>
-            </w:r>
-            <w:r>
-              <w:rPr>
-                <w:rFonts w:ascii="Century Gothic" w:hAnsi="Century Gothic" w:cs="Arial"/>
-                <w:sz w:val="20"/>
-                <w:lang w:eastAsia="en-US"/>
-              </w:rPr>
-              <w:t>5</w:t>
-            </w:r>
-            <w:r>
-              <w:rPr>
-                <w:rFonts w:ascii="Century Gothic" w:hAnsi="Century Gothic" w:cs="Arial"/>
-                <w:sz w:val="20"/>
-                <w:lang w:eastAsia="en-US"/>
-              </w:rPr>
-              <w:t>} {TEXTO_DA_RESOLUCAO} {/exibirResolucao_</w:t>
-            </w:r>
-            <w:r>
-              <w:rPr>
-                <w:rFonts w:ascii="Century Gothic" w:hAnsi="Century Gothic" w:cs="Arial"/>
-                <w:sz w:val="20"/>
-                <w:lang w:eastAsia="en-US"/>
-              </w:rPr>
-              <w:t>5</w:t>
-            </w:r>
-            <w:r>
-              <w:rPr>
-                <w:rFonts w:ascii="Century Gothic" w:hAnsi="Century Gothic" w:cs="Arial"/>
-                <w:sz w:val="20"/>
-                <w:lang w:eastAsia="en-US"/>
-              </w:rPr>
-              <w:t>}</w:t>
+              <w:t>/disciplinas}</w:t>
             </w:r>
           </w:p>
         </w:tc>
@@ -2524,8 +2310,8 @@
         <w:gridCol w:w="881"/>
         <w:gridCol w:w="1134"/>
         <w:gridCol w:w="992"/>
-        <w:gridCol w:w="4351"/>
-        <w:gridCol w:w="2268"/>
+        <w:gridCol w:w="3894"/>
+        <w:gridCol w:w="2725"/>
         <w:gridCol w:w="942"/>
       </w:tblGrid>
       <w:tr>
@@ -2675,7 +2461,7 @@
         </w:tc>
         <w:tc>
           <w:tcPr>
-            <w:tcW w:w="4351" w:type="dxa"/>
+            <w:tcW w:w="3894" w:type="dxa"/>
             <w:vAlign w:val="center"/>
           </w:tcPr>
           <w:p>
@@ -2701,7 +2487,7 @@
         </w:tc>
         <w:tc>
           <w:tcPr>
-            <w:tcW w:w="2268" w:type="dxa"/>
+            <w:tcW w:w="2725" w:type="dxa"/>
             <w:vAlign w:val="center"/>
           </w:tcPr>
           <w:p>
@@ -2836,7 +2622,7 @@
         </w:tc>
         <w:tc>
           <w:tcPr>
-            <w:tcW w:w="4351" w:type="dxa"/>
+            <w:tcW w:w="3894" w:type="dxa"/>
             <w:vAlign w:val="center"/>
           </w:tcPr>
           <w:p>
@@ -2858,7 +2644,7 @@
         </w:tc>
         <w:tc>
           <w:tcPr>
-            <w:tcW w:w="2268" w:type="dxa"/>
+            <w:tcW w:w="2725" w:type="dxa"/>
             <w:vAlign w:val="center"/>
           </w:tcPr>
           <w:p>
@@ -2981,7 +2767,7 @@
         </w:tc>
         <w:tc>
           <w:tcPr>
-            <w:tcW w:w="4351" w:type="dxa"/>
+            <w:tcW w:w="3894" w:type="dxa"/>
             <w:vAlign w:val="center"/>
           </w:tcPr>
           <w:p>
@@ -3003,7 +2789,7 @@
         </w:tc>
         <w:tc>
           <w:tcPr>
-            <w:tcW w:w="2268" w:type="dxa"/>
+            <w:tcW w:w="2725" w:type="dxa"/>
             <w:vAlign w:val="center"/>
           </w:tcPr>
           <w:p>
@@ -3126,7 +2912,7 @@
         </w:tc>
         <w:tc>
           <w:tcPr>
-            <w:tcW w:w="4351" w:type="dxa"/>
+            <w:tcW w:w="3894" w:type="dxa"/>
             <w:vAlign w:val="center"/>
           </w:tcPr>
           <w:p>
@@ -3148,7 +2934,7 @@
         </w:tc>
         <w:tc>
           <w:tcPr>
-            <w:tcW w:w="2268" w:type="dxa"/>
+            <w:tcW w:w="2725" w:type="dxa"/>
             <w:vAlign w:val="center"/>
           </w:tcPr>
           <w:p>
@@ -3279,7 +3065,7 @@
         </w:tc>
         <w:tc>
           <w:tcPr>
-            <w:tcW w:w="4351" w:type="dxa"/>
+            <w:tcW w:w="3894" w:type="dxa"/>
             <w:vAlign w:val="center"/>
           </w:tcPr>
           <w:p>
@@ -3301,7 +3087,7 @@
         </w:tc>
         <w:tc>
           <w:tcPr>
-            <w:tcW w:w="2268" w:type="dxa"/>
+            <w:tcW w:w="2725" w:type="dxa"/>
             <w:vAlign w:val="center"/>
           </w:tcPr>
           <w:p>
@@ -3423,7 +3209,7 @@
         </w:tc>
         <w:tc>
           <w:tcPr>
-            <w:tcW w:w="4351" w:type="dxa"/>
+            <w:tcW w:w="3894" w:type="dxa"/>
             <w:vAlign w:val="center"/>
           </w:tcPr>
           <w:p>
@@ -3445,7 +3231,7 @@
         </w:tc>
         <w:tc>
           <w:tcPr>
-            <w:tcW w:w="2268" w:type="dxa"/>
+            <w:tcW w:w="2725" w:type="dxa"/>
             <w:vAlign w:val="center"/>
           </w:tcPr>
           <w:p>
@@ -3493,27 +3279,6 @@
         </w:tc>
       </w:tr>
     </w:tbl>
-    <w:p>
-      <w:pPr>
-        <w:rPr>
-          <w:rFonts w:ascii="Century Gothic" w:hAnsi="Century Gothic"/>
-        </w:rPr>
-      </w:pPr>
-    </w:p>
-    <w:p>
-      <w:pPr>
-        <w:rPr>
-          <w:rFonts w:ascii="Century Gothic" w:hAnsi="Century Gothic"/>
-        </w:rPr>
-      </w:pPr>
-    </w:p>
-    <w:p>
-      <w:pPr>
-        <w:rPr>
-          <w:rFonts w:ascii="Century Gothic" w:hAnsi="Century Gothic"/>
-        </w:rPr>
-      </w:pPr>
-    </w:p>
     <w:p>
       <w:pPr>
         <w:rPr>
@@ -3597,13 +3362,6 @@
             </w:pPr>
             <w:r>
               <w:rPr>
-                <w:rFonts w:ascii="Century Gothic" w:hAnsi="Century Gothic"/>
-              </w:rPr>
-              <w:lastRenderedPageBreak/>
-              <w:br w:type="page"/>
-            </w:r>
-            <w:r>
-              <w:rPr>
                 <w:rFonts w:ascii="Century Gothic" w:hAnsi="Century Gothic" w:cs="Lucida Sans Unicode"/>
                 <w:lang w:val="pt-BR"/>
               </w:rPr>
@@ -6140,6 +5898,7 @@
                 <w:sz w:val="20"/>
                 <w:szCs w:val="20"/>
               </w:rPr>
+              <w:lastRenderedPageBreak/>
               <w:t>{OBS}</w:t>
             </w:r>
           </w:p>

</xml_diff>

<commit_message>
DOCX parcial, conclusão e transferência, completos
</commit_message>
<xml_diff>
--- a/historicos/template_concluinte.docx
+++ b/historicos/template_concluinte.docx
@@ -61,27 +61,9 @@
           </w:p>
           <w:p>
             <w:pPr>
-              <w:pStyle w:val="Ttulo5"/>
-              <w:rPr>
-                <w:rFonts w:ascii="Century Gothic" w:hAnsi="Century Gothic" w:cs="Lucida Sans Unicode"/>
-                <w:sz w:val="20"/>
-                <w:lang w:val="pt-BR"/>
-              </w:rPr>
-            </w:pPr>
-            <w:r>
-              <w:rPr>
-                <w:rFonts w:ascii="Century Gothic" w:hAnsi="Century Gothic" w:cs="Lucida Sans Unicode"/>
-                <w:sz w:val="20"/>
-                <w:lang w:val="pt-BR"/>
-              </w:rPr>
-              <w:t>DEPARTAMENTO DE AÇÕES EDUCACIONAIS</w:t>
-            </w:r>
-          </w:p>
-          <w:p>
-            <w:pPr>
               <w:jc w:val="center"/>
               <w:rPr>
-                <w:rFonts w:ascii="Century Gothic" w:hAnsi="Century Gothic" w:cs="Lucida Sans Unicode"/>
+                <w:rFonts w:ascii="Century Gothic" w:eastAsia="Arial Unicode MS" w:hAnsi="Century Gothic" w:cs="Lucida Sans Unicode"/>
                 <w:b/>
                 <w:sz w:val="20"/>
                 <w:szCs w:val="20"/>
@@ -89,21 +71,32 @@
             </w:pPr>
             <w:r>
               <w:rPr>
-                <w:rFonts w:ascii="Century Gothic" w:hAnsi="Century Gothic" w:cs="Lucida Sans Unicode"/>
+                <w:rFonts w:ascii="Century Gothic" w:eastAsia="Arial Unicode MS" w:hAnsi="Century Gothic" w:cs="Lucida Sans Unicode"/>
                 <w:b/>
                 <w:sz w:val="20"/>
                 <w:szCs w:val="20"/>
               </w:rPr>
-              <w:t xml:space="preserve">DIVISÃO </w:t>
-            </w:r>
-            <w:r>
+              <w:t>Departamento de Fortalecimento de Gestão Escolar – SE 4</w:t>
+            </w:r>
+          </w:p>
+          <w:p>
+            <w:pPr>
+              <w:jc w:val="center"/>
               <w:rPr>
                 <w:rFonts w:ascii="Century Gothic" w:hAnsi="Century Gothic" w:cs="Lucida Sans Unicode"/>
                 <w:b/>
                 <w:sz w:val="20"/>
                 <w:szCs w:val="20"/>
               </w:rPr>
-              <w:t>DE EDUCAÇÃO INFANTIL E ENSINO FUNDAMENTAL</w:t>
+            </w:pPr>
+            <w:r>
+              <w:rPr>
+                <w:rFonts w:ascii="Century Gothic" w:hAnsi="Century Gothic" w:cs="Lucida Sans Unicode"/>
+                <w:b/>
+                <w:sz w:val="20"/>
+                <w:szCs w:val="20"/>
+              </w:rPr>
+              <w:t>Seção de Tutoria do Ensino Fundamental – SE 403</w:t>
             </w:r>
           </w:p>
           <w:p>
@@ -303,7 +296,7 @@
             <v:imagedata r:id="rId8" o:title=""/>
             <w10:wrap anchorx="page" anchory="page"/>
           </v:shape>
-          <o:OLEObject Type="Embed" ProgID="MS_ClipArt_Gallery" ShapeID="_x0000_s1026" DrawAspect="Content" ObjectID="_1836464935" r:id="rId9"/>
+          <o:OLEObject Type="Embed" ProgID="MS_ClipArt_Gallery" ShapeID="_x0000_s1026" DrawAspect="Content" ObjectID="_1836470076" r:id="rId9"/>
         </w:object>
       </w:r>
       <w:r>
@@ -4247,58 +4240,41 @@
                 <w:rFonts w:ascii="Century Gothic" w:hAnsi="Century Gothic"/>
                 <w:lang w:val="pt-BR"/>
               </w:rPr>
-              <w:t>{#exibirResolucao</w:t>
-            </w:r>
-            <w:r>
-              <w:rPr>
-                <w:rFonts w:ascii="Century Gothic" w:hAnsi="Century Gothic"/>
-                <w:lang w:val="pt-BR"/>
-              </w:rPr>
-              <w:t>Transf</w:t>
-            </w:r>
-            <w:r>
-              <w:rPr>
-                <w:rFonts w:ascii="Century Gothic" w:hAnsi="Century Gothic"/>
-                <w:lang w:val="pt-BR"/>
-              </w:rPr>
-              <w:t>} {TEXTO_DA_RESOLUCAO</w:t>
-            </w:r>
-            <w:r>
-              <w:rPr>
-                <w:rFonts w:ascii="Century Gothic" w:hAnsi="Century Gothic"/>
-                <w:lang w:val="pt-BR"/>
-              </w:rPr>
-              <w:t>_TRANSF</w:t>
-            </w:r>
-            <w:r>
-              <w:rPr>
-                <w:rFonts w:ascii="Century Gothic" w:hAnsi="Century Gothic"/>
-                <w:lang w:val="pt-BR"/>
-              </w:rPr>
-              <w:t>} {/</w:t>
-            </w:r>
-            <w:proofErr w:type="spellStart"/>
-            <w:r>
-              <w:rPr>
-                <w:rFonts w:ascii="Century Gothic" w:hAnsi="Century Gothic"/>
-                <w:lang w:val="pt-BR"/>
-              </w:rPr>
-              <w:t>exibirResolucao</w:t>
-            </w:r>
-            <w:r>
-              <w:rPr>
-                <w:rFonts w:ascii="Century Gothic" w:hAnsi="Century Gothic"/>
-                <w:lang w:val="pt-BR"/>
-              </w:rPr>
-              <w:t>Transf</w:t>
-            </w:r>
-            <w:proofErr w:type="spellEnd"/>
-            <w:r>
-              <w:rPr>
-                <w:rFonts w:ascii="Century Gothic" w:hAnsi="Century Gothic"/>
-                <w:lang w:val="pt-BR"/>
-              </w:rPr>
-              <w:t>}</w:t>
+              <w:t>{#exibirResolucaoTransf1}</w:t>
+            </w:r>
+          </w:p>
+          <w:p>
+            <w:pPr>
+              <w:pStyle w:val="Ttulo3"/>
+              <w:ind w:left="113" w:right="113"/>
+              <w:rPr>
+                <w:rFonts w:ascii="Century Gothic" w:hAnsi="Century Gothic"/>
+                <w:lang w:val="pt-BR"/>
+              </w:rPr>
+            </w:pPr>
+            <w:r>
+              <w:rPr>
+                <w:rFonts w:ascii="Century Gothic" w:hAnsi="Century Gothic"/>
+                <w:lang w:val="pt-BR"/>
+              </w:rPr>
+              <w:t>{TEXTO_DA_RESOLUCAO_TRANSF1}</w:t>
+            </w:r>
+          </w:p>
+          <w:p>
+            <w:pPr>
+              <w:pStyle w:val="Ttulo3"/>
+              <w:ind w:left="113" w:right="113"/>
+              <w:rPr>
+                <w:rFonts w:ascii="Century Gothic" w:hAnsi="Century Gothic"/>
+                <w:lang w:val="pt-BR"/>
+              </w:rPr>
+            </w:pPr>
+            <w:r>
+              <w:rPr>
+                <w:rFonts w:ascii="Century Gothic" w:hAnsi="Century Gothic"/>
+                <w:lang w:val="pt-BR"/>
+              </w:rPr>
+              <w:t>{/exibirResolucaoTransf1}</w:t>
             </w:r>
           </w:p>
         </w:tc>
@@ -4320,68 +4296,51 @@
               <w:ind w:left="113" w:right="113"/>
               <w:rPr>
                 <w:rFonts w:ascii="Century Gothic" w:hAnsi="Century Gothic"/>
-                <w:b w:val="0"/>
-                <w:bCs/>
-                <w:lang w:val="pt-BR"/>
-              </w:rPr>
-            </w:pPr>
-            <w:r>
-              <w:rPr>
-                <w:rFonts w:ascii="Century Gothic" w:hAnsi="Century Gothic"/>
-                <w:lang w:val="pt-BR"/>
-              </w:rPr>
-              <w:t>{#exibirResolucao</w:t>
-            </w:r>
-            <w:r>
-              <w:rPr>
-                <w:rFonts w:ascii="Century Gothic" w:hAnsi="Century Gothic"/>
-                <w:lang w:val="pt-BR"/>
-              </w:rPr>
-              <w:t>Transf</w:t>
-            </w:r>
-            <w:r>
-              <w:rPr>
-                <w:rFonts w:ascii="Century Gothic" w:hAnsi="Century Gothic"/>
-                <w:lang w:val="pt-BR"/>
-              </w:rPr>
-              <w:t>} {TEXTO_DA_RESOLUCAO</w:t>
-            </w:r>
-            <w:r>
-              <w:rPr>
-                <w:rFonts w:ascii="Century Gothic" w:hAnsi="Century Gothic"/>
-                <w:lang w:val="pt-BR"/>
-              </w:rPr>
-              <w:t>_TRANSF</w:t>
-            </w:r>
-            <w:r>
-              <w:rPr>
-                <w:rFonts w:ascii="Century Gothic" w:hAnsi="Century Gothic"/>
-                <w:lang w:val="pt-BR"/>
-              </w:rPr>
-              <w:t>} {/</w:t>
-            </w:r>
-            <w:proofErr w:type="spellStart"/>
-            <w:r>
-              <w:rPr>
-                <w:rFonts w:ascii="Century Gothic" w:hAnsi="Century Gothic"/>
-                <w:lang w:val="pt-BR"/>
-              </w:rPr>
-              <w:t>exibirResolucao</w:t>
-            </w:r>
-            <w:r>
-              <w:rPr>
-                <w:rFonts w:ascii="Century Gothic" w:hAnsi="Century Gothic"/>
-                <w:lang w:val="pt-BR"/>
-              </w:rPr>
-              <w:t>Transf</w:t>
-            </w:r>
-            <w:proofErr w:type="spellEnd"/>
-            <w:r>
-              <w:rPr>
-                <w:rFonts w:ascii="Century Gothic" w:hAnsi="Century Gothic"/>
-                <w:lang w:val="pt-BR"/>
-              </w:rPr>
-              <w:t>}</w:t>
+                <w:lang w:val="pt-BR"/>
+              </w:rPr>
+            </w:pPr>
+            <w:r>
+              <w:rPr>
+                <w:rFonts w:ascii="Century Gothic" w:hAnsi="Century Gothic"/>
+                <w:lang w:val="pt-BR"/>
+              </w:rPr>
+              <w:t>{#exibirResolucaoTransf2}</w:t>
+            </w:r>
+          </w:p>
+          <w:p>
+            <w:pPr>
+              <w:pStyle w:val="Ttulo3"/>
+              <w:ind w:left="113" w:right="113"/>
+              <w:rPr>
+                <w:rFonts w:ascii="Century Gothic" w:hAnsi="Century Gothic"/>
+                <w:lang w:val="pt-BR"/>
+              </w:rPr>
+            </w:pPr>
+            <w:r>
+              <w:rPr>
+                <w:rFonts w:ascii="Century Gothic" w:hAnsi="Century Gothic"/>
+                <w:lang w:val="pt-BR"/>
+              </w:rPr>
+              <w:t>{TEXTO_DA_RESOLUCAO_TRANSF2}</w:t>
+            </w:r>
+          </w:p>
+          <w:p>
+            <w:pPr>
+              <w:pStyle w:val="Ttulo3"/>
+              <w:ind w:left="113" w:right="113"/>
+              <w:rPr>
+                <w:rFonts w:ascii="Century Gothic" w:hAnsi="Century Gothic"/>
+                <w:b w:val="0"/>
+                <w:bCs/>
+                <w:lang w:val="pt-BR"/>
+              </w:rPr>
+            </w:pPr>
+            <w:r>
+              <w:rPr>
+                <w:rFonts w:ascii="Century Gothic" w:hAnsi="Century Gothic"/>
+                <w:lang w:val="pt-BR"/>
+              </w:rPr>
+              <w:t>{/exibirResolucaoTransf2}</w:t>
             </w:r>
           </w:p>
         </w:tc>
@@ -4404,68 +4363,51 @@
               <w:ind w:left="113" w:right="113"/>
               <w:rPr>
                 <w:rFonts w:ascii="Century Gothic" w:hAnsi="Century Gothic"/>
-                <w:b w:val="0"/>
-                <w:bCs/>
-                <w:lang w:val="pt-BR"/>
-              </w:rPr>
-            </w:pPr>
-            <w:r>
-              <w:rPr>
-                <w:rFonts w:ascii="Century Gothic" w:hAnsi="Century Gothic"/>
-                <w:lang w:val="pt-BR"/>
-              </w:rPr>
-              <w:t>{#exibirResolucao</w:t>
-            </w:r>
-            <w:r>
-              <w:rPr>
-                <w:rFonts w:ascii="Century Gothic" w:hAnsi="Century Gothic"/>
-                <w:lang w:val="pt-BR"/>
-              </w:rPr>
-              <w:t>Transf</w:t>
-            </w:r>
-            <w:r>
-              <w:rPr>
-                <w:rFonts w:ascii="Century Gothic" w:hAnsi="Century Gothic"/>
-                <w:lang w:val="pt-BR"/>
-              </w:rPr>
-              <w:t>} {TEXTO_DA_RESOLUCAO</w:t>
-            </w:r>
-            <w:r>
-              <w:rPr>
-                <w:rFonts w:ascii="Century Gothic" w:hAnsi="Century Gothic"/>
-                <w:lang w:val="pt-BR"/>
-              </w:rPr>
-              <w:t>_TRANSF</w:t>
-            </w:r>
-            <w:r>
-              <w:rPr>
-                <w:rFonts w:ascii="Century Gothic" w:hAnsi="Century Gothic"/>
-                <w:lang w:val="pt-BR"/>
-              </w:rPr>
-              <w:t>} {/</w:t>
-            </w:r>
-            <w:proofErr w:type="spellStart"/>
-            <w:r>
-              <w:rPr>
-                <w:rFonts w:ascii="Century Gothic" w:hAnsi="Century Gothic"/>
-                <w:lang w:val="pt-BR"/>
-              </w:rPr>
-              <w:t>exibirResolucao</w:t>
-            </w:r>
-            <w:r>
-              <w:rPr>
-                <w:rFonts w:ascii="Century Gothic" w:hAnsi="Century Gothic"/>
-                <w:lang w:val="pt-BR"/>
-              </w:rPr>
-              <w:t>Transf</w:t>
-            </w:r>
-            <w:proofErr w:type="spellEnd"/>
-            <w:r>
-              <w:rPr>
-                <w:rFonts w:ascii="Century Gothic" w:hAnsi="Century Gothic"/>
-                <w:lang w:val="pt-BR"/>
-              </w:rPr>
-              <w:t>}</w:t>
+                <w:lang w:val="pt-BR"/>
+              </w:rPr>
+            </w:pPr>
+            <w:r>
+              <w:rPr>
+                <w:rFonts w:ascii="Century Gothic" w:hAnsi="Century Gothic"/>
+                <w:lang w:val="pt-BR"/>
+              </w:rPr>
+              <w:t>{#exibirResolucaoTransf3}</w:t>
+            </w:r>
+          </w:p>
+          <w:p>
+            <w:pPr>
+              <w:pStyle w:val="Ttulo3"/>
+              <w:ind w:left="113" w:right="113"/>
+              <w:rPr>
+                <w:rFonts w:ascii="Century Gothic" w:hAnsi="Century Gothic"/>
+                <w:lang w:val="pt-BR"/>
+              </w:rPr>
+            </w:pPr>
+            <w:r>
+              <w:rPr>
+                <w:rFonts w:ascii="Century Gothic" w:hAnsi="Century Gothic"/>
+                <w:lang w:val="pt-BR"/>
+              </w:rPr>
+              <w:t>{TEXTO_DA_RESOLUCAO_TRANSF3}</w:t>
+            </w:r>
+          </w:p>
+          <w:p>
+            <w:pPr>
+              <w:pStyle w:val="Ttulo3"/>
+              <w:ind w:left="113" w:right="113"/>
+              <w:rPr>
+                <w:rFonts w:ascii="Century Gothic" w:hAnsi="Century Gothic"/>
+                <w:b w:val="0"/>
+                <w:bCs/>
+                <w:lang w:val="pt-BR"/>
+              </w:rPr>
+            </w:pPr>
+            <w:r>
+              <w:rPr>
+                <w:rFonts w:ascii="Century Gothic" w:hAnsi="Century Gothic"/>
+                <w:lang w:val="pt-BR"/>
+              </w:rPr>
+              <w:t>{/exibirResolucaoTransf3}</w:t>
             </w:r>
           </w:p>
         </w:tc>
@@ -5802,17 +5744,17 @@
           </w:tcPr>
           <w:p>
             <w:pPr>
-              <w:spacing w:after="160"/>
+              <w:spacing w:after="60"/>
               <w:jc w:val="both"/>
               <w:rPr>
                 <w:rFonts w:ascii="Century Gothic" w:hAnsi="Century Gothic"/>
+                <w:sz w:val="20"/>
+                <w:szCs w:val="20"/>
               </w:rPr>
             </w:pPr>
             <w:r>
               <w:rPr>
                 <w:rFonts w:ascii="Century Gothic" w:hAnsi="Century Gothic" w:cs="Calibri"/>
-                <w:b/>
-                <w:bCs/>
                 <w:color w:val="000000"/>
                 <w:sz w:val="20"/>
                 <w:szCs w:val="20"/>

</xml_diff>